<commit_message>
Extend surveillance with time-varying exposure and competing risks
</commit_message>
<xml_diff>
--- a/results/report/OccuSurv_report.docx
+++ b/results/report/OccuSurv_report.docx
@@ -17,7 +17,7 @@
     </w:p>
     <w:p>
       <w:r>
-        <w:t>Research software validation report | OccuSurv NF version 0.1.0 | Seed 2026</w:t>
+        <w:t>Research software validation report | OccuSurv NF version 0.2.0 | Seed 2026</w:t>
       </w:r>
     </w:p>
     <w:p>
@@ -2174,6 +2174,1005 @@
         <w:pStyle w:val="Heading1"/>
       </w:pPr>
       <w:r>
+        <w:t>Time varying exposure and competing events</w:t>
+      </w:r>
+    </w:p>
+    <w:p>
+      <w:r>
+        <w:t>This extension generates new follow-up outcomes for the same eligible baseline disease-free workers. It is a separate scenario, not an additional follow-up phase and not a paired estimate of the effect of adding mortality. The preceding baseline reference results are retained unchanged.</w:t>
+      </w:r>
+    </w:p>
+    <w:p>
+      <w:r>
+        <w:t>Annual concentration equals historical concentration times independent lognormal noise with log SD 0.25, multiplied by 0.65 from year three. This planned reduction is illustrative, not an estimated causal intervention. Historical exposure enters the cumulative measure only once it is at least five years old.</w:t>
+      </w:r>
+    </w:p>
+    <w:p>
+      <w:r>
+        <w:drawing>
+          <wp:inline xmlns:a="http://schemas.openxmlformats.org/drawingml/2006/main" xmlns:pic="http://schemas.openxmlformats.org/drawingml/2006/picture">
+            <wp:extent cx="6035040" cy="1035260"/>
+            <wp:docPr id="16" name="Picture 16"/>
+            <wp:cNvGraphicFramePr>
+              <a:graphicFrameLocks noChangeAspect="1"/>
+            </wp:cNvGraphicFramePr>
+            <a:graphic>
+              <a:graphicData uri="http://schemas.openxmlformats.org/drawingml/2006/picture">
+                <pic:pic>
+                  <pic:nvPicPr>
+                    <pic:cNvPr id="0" name="tv_exposure.png"/>
+                    <pic:cNvPicPr/>
+                  </pic:nvPicPr>
+                  <pic:blipFill>
+                    <a:blip r:embed="rId24"/>
+                    <a:stretch>
+                      <a:fillRect/>
+                    </a:stretch>
+                  </pic:blipFill>
+                  <pic:spPr>
+                    <a:xfrm>
+                      <a:off x="0" y="0"/>
+                      <a:ext cx="6035040" cy="1035260"/>
+                    </a:xfrm>
+                    <a:prstGeom prst="rect"/>
+                  </pic:spPr>
+                </pic:pic>
+              </a:graphicData>
+            </a:graphic>
+          </wp:inline>
+        </w:drawing>
+      </w:r>
+    </w:p>
+    <w:p>
+      <w:r>
+        <w:t>At integer year k, ci and di are baseline historical concentration and employment duration; eim is the concentration during post-baseline year m, integrated over one year. An empty sum is zero. This is the exposure integral up to k minus five years. It is held constant on each annual risk interval and includes no future exposure.</w:t>
+      </w:r>
+    </w:p>
+    <w:p>
+      <w:r>
+        <w:drawing>
+          <wp:inline xmlns:a="http://schemas.openxmlformats.org/drawingml/2006/main" xmlns:pic="http://schemas.openxmlformats.org/drawingml/2006/picture">
+            <wp:extent cx="6035040" cy="531117"/>
+            <wp:docPr id="17" name="Picture 17"/>
+            <wp:cNvGraphicFramePr>
+              <a:graphicFrameLocks noChangeAspect="1"/>
+            </wp:cNvGraphicFramePr>
+            <a:graphic>
+              <a:graphicData uri="http://schemas.openxmlformats.org/drawingml/2006/picture">
+                <pic:pic>
+                  <pic:nvPicPr>
+                    <pic:cNvPr id="0" name="tv_hazard.png"/>
+                    <pic:cNvPicPr/>
+                  </pic:nvPicPr>
+                  <pic:blipFill>
+                    <a:blip r:embed="rId25"/>
+                    <a:stretch>
+                      <a:fillRect/>
+                    </a:stretch>
+                  </pic:blipFill>
+                  <pic:spPr>
+                    <a:xfrm>
+                      <a:off x="0" y="0"/>
+                      <a:ext cx="6035040" cy="531117"/>
+                    </a:xfrm>
+                    <a:prstGeom prst="rect"/>
+                  </pic:spPr>
+                </pic:pic>
+              </a:graphicData>
+            </a:graphic>
+          </wp:inline>
+        </w:drawing>
+      </w:r>
+    </w:p>
+    <w:p>
+      <w:r>
+        <w:t>For k &lt; t &lt;= k+1, j=1 is diagnosis and j=2 is competing death. The baseline rates are 0.018 and 0.025 per year. Disease HRs are 1.7, 1.3 and 1.5; death HRs are 1.0, 1.5 and 1.2. All are simulation assumptions. Age is baseline age per decade and smoking is fixed.</w:t>
+      </w:r>
+    </w:p>
+    <w:p>
+      <w:r>
+        <w:drawing>
+          <wp:inline xmlns:a="http://schemas.openxmlformats.org/drawingml/2006/main" xmlns:pic="http://schemas.openxmlformats.org/drawingml/2006/picture">
+            <wp:extent cx="6035040" cy="762456"/>
+            <wp:docPr id="18" name="Picture 18"/>
+            <wp:cNvGraphicFramePr>
+              <a:graphicFrameLocks noChangeAspect="1"/>
+            </wp:cNvGraphicFramePr>
+            <a:graphic>
+              <a:graphicData uri="http://schemas.openxmlformats.org/drawingml/2006/picture">
+                <pic:pic>
+                  <pic:nvPicPr>
+                    <pic:cNvPr id="0" name="tv_risk.png"/>
+                    <pic:cNvPicPr/>
+                  </pic:nvPicPr>
+                  <pic:blipFill>
+                    <a:blip r:embed="rId26"/>
+                    <a:stretch>
+                      <a:fillRect/>
+                    </a:stretch>
+                  </pic:blipFill>
+                  <pic:spPr>
+                    <a:xfrm>
+                      <a:off x="0" y="0"/>
+                      <a:ext cx="6035040" cy="762456"/>
+                    </a:xfrm>
+                    <a:prstGeom prst="rect"/>
+                  </pic:spPr>
+                </pic:pic>
+              </a:graphicData>
+            </a:graphic>
+          </wp:inline>
+        </w:drawing>
+      </w:r>
+    </w:p>
+    <w:p>
+      <w:r>
+        <w:t>Each subject contributes at most one row to the risk set at an event time. Cause-specific Cox likelihood uses the covariates on that active row, and removes either first diagnosis or death thereafter. Other causes contribute a zero cause-specific event indicator. This estimates a cause-specific hazard, not an absolute risk or a Fine-Gray subdistribution hazard.</w:t>
+      </w:r>
+    </w:p>
+    <w:p>
+      <w:r>
+        <w:t>Within each annual interval, waiting time is exponential with the sum of the two hazard rates. If a first event occurs before the next boundary or independent censoring, its cause is selected with probability proportional to its rate. Follow-up stops at that event. Censoring is the minimum of eight years and Exponential(mean 25 years).</w:t>
+      </w:r>
+    </w:p>
+    <w:p>
+      <w:r>
+        <w:t>QC requires contiguous nonoverlapping intervals from baseline to terminal time, one terminal event at most, consistent cause coding, valid exposure schedules and no post-event observations. Only complete workers enter both cause-specific models. Each model is skipped below 30 events of its own cause.</w:t>
+      </w:r>
+    </w:p>
+    <w:p>
+      <w:r>
+        <w:br w:type="page"/>
+      </w:r>
+    </w:p>
+    <w:p>
+      <w:pPr>
+        <w:pStyle w:val="Heading1"/>
+      </w:pPr>
+      <w:r>
+        <w:t>Cumulative incidence with competing mortality</w:t>
+      </w:r>
+    </w:p>
+    <w:p>
+      <w:r>
+        <w:drawing>
+          <wp:inline xmlns:a="http://schemas.openxmlformats.org/drawingml/2006/main" xmlns:pic="http://schemas.openxmlformats.org/drawingml/2006/picture">
+            <wp:extent cx="6035040" cy="834295"/>
+            <wp:docPr id="19" name="Picture 19"/>
+            <wp:cNvGraphicFramePr>
+              <a:graphicFrameLocks noChangeAspect="1"/>
+            </wp:cNvGraphicFramePr>
+            <a:graphic>
+              <a:graphicData uri="http://schemas.openxmlformats.org/drawingml/2006/picture">
+                <pic:pic>
+                  <pic:nvPicPr>
+                    <pic:cNvPr id="0" name="aj.png"/>
+                    <pic:cNvPicPr/>
+                  </pic:nvPicPr>
+                  <pic:blipFill>
+                    <a:blip r:embed="rId27"/>
+                    <a:stretch>
+                      <a:fillRect/>
+                    </a:stretch>
+                  </pic:blipFill>
+                  <pic:spPr>
+                    <a:xfrm>
+                      <a:off x="0" y="0"/>
+                      <a:ext cx="6035040" cy="834295"/>
+                    </a:xfrm>
+                    <a:prstGeom prst="rect"/>
+                  </pic:spPr>
+                </pic:pic>
+              </a:graphicData>
+            </a:graphic>
+          </wp:inline>
+        </w:drawing>
+      </w:r>
+    </w:p>
+    <w:p>
+      <w:r>
+        <w:t>Aalen-Johansen cumulative incidence integrates the cause-specific event fraction against survival free of either event. F1+F2+S=1. Disease probability is not one minus Kaplan-Meier when deaths preclude diagnosis. Confidence limits are pointwise percentile intervals from 200 whole-worker bootstrap samples within each reported group; they are not simultaneous bands or cluster-robust intervals.</w:t>
+      </w:r>
+    </w:p>
+    <w:p>
+      <w:r>
+        <w:drawing>
+          <wp:inline xmlns:a="http://schemas.openxmlformats.org/drawingml/2006/main" xmlns:pic="http://schemas.openxmlformats.org/drawingml/2006/picture">
+            <wp:extent cx="6035040" cy="3168396"/>
+            <wp:docPr id="20" name="Picture 20"/>
+            <wp:cNvGraphicFramePr>
+              <a:graphicFrameLocks noChangeAspect="1"/>
+            </wp:cNvGraphicFramePr>
+            <a:graphic>
+              <a:graphicData uri="http://schemas.openxmlformats.org/drawingml/2006/picture">
+                <pic:pic>
+                  <pic:nvPicPr>
+                    <pic:cNvPr id="0" name="cumulative_incidence.png"/>
+                    <pic:cNvPicPr/>
+                  </pic:nvPicPr>
+                  <pic:blipFill>
+                    <a:blip r:embed="rId28"/>
+                    <a:stretch>
+                      <a:fillRect/>
+                    </a:stretch>
+                  </pic:blipFill>
+                  <pic:spPr>
+                    <a:xfrm>
+                      <a:off x="0" y="0"/>
+                      <a:ext cx="6035040" cy="3168396"/>
+                    </a:xfrm>
+                    <a:prstGeom prst="rect"/>
+                  </pic:spPr>
+                </pic:pic>
+              </a:graphicData>
+            </a:graphic>
+          </wp:inline>
+        </w:drawing>
+      </w:r>
+    </w:p>
+    <w:p>
+      <w:pPr>
+        <w:spacing w:after="180"/>
+      </w:pPr>
+      <w:r>
+        <w:rPr>
+          <w:sz w:val="20"/>
+        </w:rPr>
+        <w:t>Figure 6. Aalen-Johansen disease and death probabilities with pointwise bootstrap intervals. The dashed disease curve treats death as censoring and therefore does not estimate the observed disease probability.</w:t>
+      </w:r>
+    </w:p>
+    <w:tbl>
+      <w:tblPr>
+        <w:tblStyle w:val="LightShading-Accent1"/>
+        <w:tblW w:type="auto" w:w="0"/>
+        <w:tblLook w:firstColumn="1" w:firstRow="1" w:lastColumn="0" w:lastRow="0" w:noHBand="0" w:noVBand="1" w:val="04A0"/>
+      </w:tblPr>
+      <w:tblGrid>
+        <w:gridCol w:w="3312"/>
+        <w:gridCol w:w="3312"/>
+        <w:gridCol w:w="3312"/>
+      </w:tblGrid>
+      <w:tr>
+        <w:trPr>
+          <w:tblHeader/>
+        </w:trPr>
+        <w:tc>
+          <w:tcPr>
+            <w:tcW w:type="dxa" w:w="3312"/>
+            <w:shd w:fill="E8EDF0"/>
+          </w:tcPr>
+          <w:p>
+            <w:r>
+              <w:rPr>
+                <w:b/>
+                <w:color w:val="000000"/>
+                <w:sz w:val="20"/>
+              </w:rPr>
+              <w:t>Cause at eight years</w:t>
+            </w:r>
+          </w:p>
+        </w:tc>
+        <w:tc>
+          <w:tcPr>
+            <w:tcW w:type="dxa" w:w="3312"/>
+            <w:shd w:fill="E8EDF0"/>
+          </w:tcPr>
+          <w:p>
+            <w:r>
+              <w:rPr>
+                <w:b/>
+                <w:color w:val="000000"/>
+                <w:sz w:val="20"/>
+              </w:rPr>
+              <w:t>Probability</w:t>
+            </w:r>
+          </w:p>
+        </w:tc>
+        <w:tc>
+          <w:tcPr>
+            <w:tcW w:type="dxa" w:w="3312"/>
+            <w:shd w:fill="E8EDF0"/>
+          </w:tcPr>
+          <w:p>
+            <w:r>
+              <w:rPr>
+                <w:b/>
+                <w:color w:val="000000"/>
+                <w:sz w:val="20"/>
+              </w:rPr>
+              <w:t>95 percent interval</w:t>
+            </w:r>
+          </w:p>
+        </w:tc>
+      </w:tr>
+      <w:tr>
+        <w:tc>
+          <w:tcPr>
+            <w:tcW w:type="dxa" w:w="3312"/>
+          </w:tcPr>
+          <w:p>
+            <w:r>
+              <w:rPr>
+                <w:sz w:val="20"/>
+              </w:rPr>
+              <w:t>disease</w:t>
+            </w:r>
+          </w:p>
+        </w:tc>
+        <w:tc>
+          <w:tcPr>
+            <w:tcW w:type="dxa" w:w="3312"/>
+          </w:tcPr>
+          <w:p>
+            <w:r>
+              <w:rPr>
+                <w:sz w:val="20"/>
+              </w:rPr>
+              <w:t>0.217</w:t>
+            </w:r>
+          </w:p>
+        </w:tc>
+        <w:tc>
+          <w:tcPr>
+            <w:tcW w:type="dxa" w:w="3312"/>
+          </w:tcPr>
+          <w:p>
+            <w:r>
+              <w:rPr>
+                <w:sz w:val="20"/>
+              </w:rPr>
+              <w:t>0.180 to 0.255</w:t>
+            </w:r>
+          </w:p>
+        </w:tc>
+      </w:tr>
+      <w:tr>
+        <w:tc>
+          <w:tcPr>
+            <w:tcW w:type="dxa" w:w="3312"/>
+          </w:tcPr>
+          <w:p>
+            <w:r>
+              <w:rPr>
+                <w:sz w:val="20"/>
+              </w:rPr>
+              <w:t>death</w:t>
+            </w:r>
+          </w:p>
+        </w:tc>
+        <w:tc>
+          <w:tcPr>
+            <w:tcW w:type="dxa" w:w="3312"/>
+          </w:tcPr>
+          <w:p>
+            <w:r>
+              <w:rPr>
+                <w:sz w:val="20"/>
+              </w:rPr>
+              <w:t>0.198</w:t>
+            </w:r>
+          </w:p>
+        </w:tc>
+        <w:tc>
+          <w:tcPr>
+            <w:tcW w:type="dxa" w:w="3312"/>
+          </w:tcPr>
+          <w:p>
+            <w:r>
+              <w:rPr>
+                <w:sz w:val="20"/>
+              </w:rPr>
+              <w:t>0.163 to 0.231</w:t>
+            </w:r>
+          </w:p>
+        </w:tc>
+      </w:tr>
+    </w:tbl>
+    <w:p/>
+    <w:p>
+      <w:r>
+        <w:t>The extension includes 477 workers, 2743 at-risk intervals, 93 diagnoses and 83 competing deaths over 2603.4 person-years. Independent censoring and absence of residual workplace dependence are assumed. Bootstrap draws resample whole workers, never individual interval rows.</w:t>
+      </w:r>
+    </w:p>
+    <w:p>
+      <w:r>
+        <w:br w:type="page"/>
+      </w:r>
+    </w:p>
+    <w:p>
+      <w:pPr>
+        <w:pStyle w:val="Heading1"/>
+      </w:pPr>
+      <w:r>
+        <w:t>Exposure trajectories and industry probabilities</w:t>
+      </w:r>
+    </w:p>
+    <w:p>
+      <w:r>
+        <w:drawing>
+          <wp:inline xmlns:a="http://schemas.openxmlformats.org/drawingml/2006/main" xmlns:pic="http://schemas.openxmlformats.org/drawingml/2006/picture">
+            <wp:extent cx="6035040" cy="2414016"/>
+            <wp:docPr id="21" name="Picture 21"/>
+            <wp:cNvGraphicFramePr>
+              <a:graphicFrameLocks noChangeAspect="1"/>
+            </wp:cNvGraphicFramePr>
+            <a:graphic>
+              <a:graphicData uri="http://schemas.openxmlformats.org/drawingml/2006/picture">
+                <pic:pic>
+                  <pic:nvPicPr>
+                    <pic:cNvPr id="0" name="exposure_history.png"/>
+                    <pic:cNvPicPr/>
+                  </pic:nvPicPr>
+                  <pic:blipFill>
+                    <a:blip r:embed="rId29"/>
+                    <a:stretch>
+                      <a:fillRect/>
+                    </a:stretch>
+                  </pic:blipFill>
+                  <pic:spPr>
+                    <a:xfrm>
+                      <a:off x="0" y="0"/>
+                      <a:ext cx="6035040" cy="2414016"/>
+                    </a:xfrm>
+                    <a:prstGeom prst="rect"/>
+                  </pic:spPr>
+                </pic:pic>
+              </a:graphicData>
+            </a:graphic>
+          </wp:inline>
+        </w:drawing>
+      </w:r>
+    </w:p>
+    <w:p>
+      <w:pPr>
+        <w:spacing w:after="180"/>
+      </w:pPr>
+      <w:r>
+        <w:rPr>
+          <w:sz w:val="20"/>
+        </w:rPr>
+        <w:t>Figure 7. Medians among workers still under observation. Changes reflect both the planned schedules and changing risk-set composition; later latent exposure values are never used after an event.</w:t>
+      </w:r>
+    </w:p>
+    <w:p>
+      <w:r>
+        <w:drawing>
+          <wp:inline xmlns:a="http://schemas.openxmlformats.org/drawingml/2006/main" xmlns:pic="http://schemas.openxmlformats.org/drawingml/2006/picture">
+            <wp:extent cx="6035040" cy="3017520"/>
+            <wp:docPr id="22" name="Picture 22"/>
+            <wp:cNvGraphicFramePr>
+              <a:graphicFrameLocks noChangeAspect="1"/>
+            </wp:cNvGraphicFramePr>
+            <a:graphic>
+              <a:graphicData uri="http://schemas.openxmlformats.org/drawingml/2006/picture">
+                <pic:pic>
+                  <pic:nvPicPr>
+                    <pic:cNvPr id="0" name="cif_by_industry.png"/>
+                    <pic:cNvPicPr/>
+                  </pic:nvPicPr>
+                  <pic:blipFill>
+                    <a:blip r:embed="rId30"/>
+                    <a:stretch>
+                      <a:fillRect/>
+                    </a:stretch>
+                  </pic:blipFill>
+                  <pic:spPr>
+                    <a:xfrm>
+                      <a:off x="0" y="0"/>
+                      <a:ext cx="6035040" cy="3017520"/>
+                    </a:xfrm>
+                    <a:prstGeom prst="rect"/>
+                  </pic:spPr>
+                </pic:pic>
+              </a:graphicData>
+            </a:graphic>
+          </wp:inline>
+        </w:drawing>
+      </w:r>
+    </w:p>
+    <w:p>
+      <w:pPr>
+        <w:spacing w:after="180"/>
+      </w:pPr>
+      <w:r>
+        <w:rPr>
+          <w:sz w:val="20"/>
+        </w:rPr>
+        <w:t>Figure 8. Unadjusted diagnosis cumulative incidence by industry with pointwise bootstrap intervals. Industry comparisons are descriptive and incorporate competing mortality.</w:t>
+      </w:r>
+    </w:p>
+    <w:p>
+      <w:r>
+        <w:t>Full planned exposure histories are stored for auditing the simulation. They are explicitly latent schedules, not post-death measurements. The models use only rows with positive at-risk duration before the first event or censoring.</w:t>
+      </w:r>
+    </w:p>
+    <w:p>
+      <w:r>
+        <w:br w:type="page"/>
+      </w:r>
+    </w:p>
+    <w:p>
+      <w:pPr>
+        <w:pStyle w:val="Heading1"/>
+      </w:pPr>
+      <w:r>
+        <w:t>Time varying cause specific associations</w:t>
+      </w:r>
+    </w:p>
+    <w:p>
+      <w:r>
+        <w:drawing>
+          <wp:inline xmlns:a="http://schemas.openxmlformats.org/drawingml/2006/main" xmlns:pic="http://schemas.openxmlformats.org/drawingml/2006/picture">
+            <wp:extent cx="6035040" cy="2414016"/>
+            <wp:docPr id="23" name="Picture 23"/>
+            <wp:cNvGraphicFramePr>
+              <a:graphicFrameLocks noChangeAspect="1"/>
+            </wp:cNvGraphicFramePr>
+            <a:graphic>
+              <a:graphicData uri="http://schemas.openxmlformats.org/drawingml/2006/picture">
+                <pic:pic>
+                  <pic:nvPicPr>
+                    <pic:cNvPr id="0" name="time_varying_hr.png"/>
+                    <pic:cNvPicPr/>
+                  </pic:nvPicPr>
+                  <pic:blipFill>
+                    <a:blip r:embed="rId31"/>
+                    <a:stretch>
+                      <a:fillRect/>
+                    </a:stretch>
+                  </pic:blipFill>
+                  <pic:spPr>
+                    <a:xfrm>
+                      <a:off x="0" y="0"/>
+                      <a:ext cx="6035040" cy="2414016"/>
+                    </a:xfrm>
+                    <a:prstGeom prst="rect"/>
+                  </pic:spPr>
+                </pic:pic>
+              </a:graphicData>
+            </a:graphic>
+          </wp:inline>
+        </w:drawing>
+      </w:r>
+    </w:p>
+    <w:p>
+      <w:pPr>
+        <w:spacing w:after="180"/>
+      </w:pPr>
+      <w:r>
+        <w:rPr>
+          <w:sz w:val="20"/>
+        </w:rPr>
+        <w:t>Figure 9. Cause-specific Cox HRs with 95 percent model-based Wald intervals. Crosses show assumed generating HRs. An HR changes an instantaneous rate among event-free workers, not an absolute cumulative risk.</w:t>
+      </w:r>
+    </w:p>
+    <w:tbl>
+      <w:tblPr>
+        <w:tblStyle w:val="LightShading-Accent1"/>
+        <w:tblW w:type="auto" w:w="0"/>
+        <w:tblLook w:firstColumn="1" w:firstRow="1" w:lastColumn="0" w:lastRow="0" w:noHBand="0" w:noVBand="1" w:val="04A0"/>
+      </w:tblPr>
+      <w:tblGrid>
+        <w:gridCol w:w="2484"/>
+        <w:gridCol w:w="2484"/>
+        <w:gridCol w:w="2484"/>
+        <w:gridCol w:w="2484"/>
+      </w:tblGrid>
+      <w:tr>
+        <w:trPr>
+          <w:tblHeader/>
+        </w:trPr>
+        <w:tc>
+          <w:tcPr>
+            <w:tcW w:type="dxa" w:w="2484"/>
+            <w:shd w:fill="E8EDF0"/>
+          </w:tcPr>
+          <w:p>
+            <w:r>
+              <w:rPr>
+                <w:b/>
+                <w:color w:val="000000"/>
+                <w:sz w:val="20"/>
+              </w:rPr>
+              <w:t>Cause</w:t>
+            </w:r>
+          </w:p>
+        </w:tc>
+        <w:tc>
+          <w:tcPr>
+            <w:tcW w:type="dxa" w:w="2484"/>
+            <w:shd w:fill="E8EDF0"/>
+          </w:tcPr>
+          <w:p>
+            <w:r>
+              <w:rPr>
+                <w:b/>
+                <w:color w:val="000000"/>
+                <w:sz w:val="20"/>
+              </w:rPr>
+              <w:t>Covariate</w:t>
+            </w:r>
+          </w:p>
+        </w:tc>
+        <w:tc>
+          <w:tcPr>
+            <w:tcW w:type="dxa" w:w="2484"/>
+            <w:shd w:fill="E8EDF0"/>
+          </w:tcPr>
+          <w:p>
+            <w:r>
+              <w:rPr>
+                <w:b/>
+                <w:color w:val="000000"/>
+                <w:sz w:val="20"/>
+              </w:rPr>
+              <w:t>HR</w:t>
+            </w:r>
+          </w:p>
+        </w:tc>
+        <w:tc>
+          <w:tcPr>
+            <w:tcW w:type="dxa" w:w="2484"/>
+            <w:shd w:fill="E8EDF0"/>
+          </w:tcPr>
+          <w:p>
+            <w:r>
+              <w:rPr>
+                <w:b/>
+                <w:color w:val="000000"/>
+                <w:sz w:val="20"/>
+              </w:rPr>
+              <w:t>95 percent CI</w:t>
+            </w:r>
+          </w:p>
+        </w:tc>
+      </w:tr>
+      <w:tr>
+        <w:tc>
+          <w:tcPr>
+            <w:tcW w:type="dxa" w:w="2484"/>
+          </w:tcPr>
+          <w:p>
+            <w:r>
+              <w:rPr>
+                <w:sz w:val="20"/>
+              </w:rPr>
+              <w:t>Diagnosis</w:t>
+            </w:r>
+          </w:p>
+        </w:tc>
+        <w:tc>
+          <w:tcPr>
+            <w:tcW w:type="dxa" w:w="2484"/>
+          </w:tcPr>
+          <w:p>
+            <w:r>
+              <w:rPr>
+                <w:sz w:val="20"/>
+              </w:rPr>
+              <w:t>Lagged exposure</w:t>
+            </w:r>
+          </w:p>
+        </w:tc>
+        <w:tc>
+          <w:tcPr>
+            <w:tcW w:type="dxa" w:w="2484"/>
+          </w:tcPr>
+          <w:p>
+            <w:r>
+              <w:rPr>
+                <w:sz w:val="20"/>
+              </w:rPr>
+              <w:t>1.759</w:t>
+            </w:r>
+          </w:p>
+        </w:tc>
+        <w:tc>
+          <w:tcPr>
+            <w:tcW w:type="dxa" w:w="2484"/>
+          </w:tcPr>
+          <w:p>
+            <w:r>
+              <w:rPr>
+                <w:sz w:val="20"/>
+              </w:rPr>
+              <w:t>1.253 to 2.468</w:t>
+            </w:r>
+          </w:p>
+        </w:tc>
+      </w:tr>
+      <w:tr>
+        <w:tc>
+          <w:tcPr>
+            <w:tcW w:type="dxa" w:w="2484"/>
+          </w:tcPr>
+          <w:p>
+            <w:r>
+              <w:rPr>
+                <w:sz w:val="20"/>
+              </w:rPr>
+              <w:t>Diagnosis</w:t>
+            </w:r>
+          </w:p>
+        </w:tc>
+        <w:tc>
+          <w:tcPr>
+            <w:tcW w:type="dxa" w:w="2484"/>
+          </w:tcPr>
+          <w:p>
+            <w:r>
+              <w:rPr>
+                <w:sz w:val="20"/>
+              </w:rPr>
+              <w:t>Age per decade</w:t>
+            </w:r>
+          </w:p>
+        </w:tc>
+        <w:tc>
+          <w:tcPr>
+            <w:tcW w:type="dxa" w:w="2484"/>
+          </w:tcPr>
+          <w:p>
+            <w:r>
+              <w:rPr>
+                <w:sz w:val="20"/>
+              </w:rPr>
+              <w:t>1.264</w:t>
+            </w:r>
+          </w:p>
+        </w:tc>
+        <w:tc>
+          <w:tcPr>
+            <w:tcW w:type="dxa" w:w="2484"/>
+          </w:tcPr>
+          <w:p>
+            <w:r>
+              <w:rPr>
+                <w:sz w:val="20"/>
+              </w:rPr>
+              <w:t>1.035 to 1.544</w:t>
+            </w:r>
+          </w:p>
+        </w:tc>
+      </w:tr>
+      <w:tr>
+        <w:tc>
+          <w:tcPr>
+            <w:tcW w:type="dxa" w:w="2484"/>
+          </w:tcPr>
+          <w:p>
+            <w:r>
+              <w:rPr>
+                <w:sz w:val="20"/>
+              </w:rPr>
+              <w:t>Diagnosis</w:t>
+            </w:r>
+          </w:p>
+        </w:tc>
+        <w:tc>
+          <w:tcPr>
+            <w:tcW w:type="dxa" w:w="2484"/>
+          </w:tcPr>
+          <w:p>
+            <w:r>
+              <w:rPr>
+                <w:sz w:val="20"/>
+              </w:rPr>
+              <w:t>Smoker</w:t>
+            </w:r>
+          </w:p>
+        </w:tc>
+        <w:tc>
+          <w:tcPr>
+            <w:tcW w:type="dxa" w:w="2484"/>
+          </w:tcPr>
+          <w:p>
+            <w:r>
+              <w:rPr>
+                <w:sz w:val="20"/>
+              </w:rPr>
+              <w:t>1.354</w:t>
+            </w:r>
+          </w:p>
+        </w:tc>
+        <w:tc>
+          <w:tcPr>
+            <w:tcW w:type="dxa" w:w="2484"/>
+          </w:tcPr>
+          <w:p>
+            <w:r>
+              <w:rPr>
+                <w:sz w:val="20"/>
+              </w:rPr>
+              <w:t>0.889 to 2.063</w:t>
+            </w:r>
+          </w:p>
+        </w:tc>
+      </w:tr>
+      <w:tr>
+        <w:tc>
+          <w:tcPr>
+            <w:tcW w:type="dxa" w:w="2484"/>
+          </w:tcPr>
+          <w:p>
+            <w:r>
+              <w:rPr>
+                <w:sz w:val="20"/>
+              </w:rPr>
+              <w:t>Death</w:t>
+            </w:r>
+          </w:p>
+        </w:tc>
+        <w:tc>
+          <w:tcPr>
+            <w:tcW w:type="dxa" w:w="2484"/>
+          </w:tcPr>
+          <w:p>
+            <w:r>
+              <w:rPr>
+                <w:sz w:val="20"/>
+              </w:rPr>
+              <w:t>Lagged exposure</w:t>
+            </w:r>
+          </w:p>
+        </w:tc>
+        <w:tc>
+          <w:tcPr>
+            <w:tcW w:type="dxa" w:w="2484"/>
+          </w:tcPr>
+          <w:p>
+            <w:r>
+              <w:rPr>
+                <w:sz w:val="20"/>
+              </w:rPr>
+              <w:t>1.078</w:t>
+            </w:r>
+          </w:p>
+        </w:tc>
+        <w:tc>
+          <w:tcPr>
+            <w:tcW w:type="dxa" w:w="2484"/>
+          </w:tcPr>
+          <w:p>
+            <w:r>
+              <w:rPr>
+                <w:sz w:val="20"/>
+              </w:rPr>
+              <w:t>0.728 to 1.595</w:t>
+            </w:r>
+          </w:p>
+        </w:tc>
+      </w:tr>
+      <w:tr>
+        <w:tc>
+          <w:tcPr>
+            <w:tcW w:type="dxa" w:w="2484"/>
+          </w:tcPr>
+          <w:p>
+            <w:r>
+              <w:rPr>
+                <w:sz w:val="20"/>
+              </w:rPr>
+              <w:t>Death</w:t>
+            </w:r>
+          </w:p>
+        </w:tc>
+        <w:tc>
+          <w:tcPr>
+            <w:tcW w:type="dxa" w:w="2484"/>
+          </w:tcPr>
+          <w:p>
+            <w:r>
+              <w:rPr>
+                <w:sz w:val="20"/>
+              </w:rPr>
+              <w:t>Age per decade</w:t>
+            </w:r>
+          </w:p>
+        </w:tc>
+        <w:tc>
+          <w:tcPr>
+            <w:tcW w:type="dxa" w:w="2484"/>
+          </w:tcPr>
+          <w:p>
+            <w:r>
+              <w:rPr>
+                <w:sz w:val="20"/>
+              </w:rPr>
+              <w:t>1.360</w:t>
+            </w:r>
+          </w:p>
+        </w:tc>
+        <w:tc>
+          <w:tcPr>
+            <w:tcW w:type="dxa" w:w="2484"/>
+          </w:tcPr>
+          <w:p>
+            <w:r>
+              <w:rPr>
+                <w:sz w:val="20"/>
+              </w:rPr>
+              <w:t>1.110 to 1.666</w:t>
+            </w:r>
+          </w:p>
+        </w:tc>
+      </w:tr>
+      <w:tr>
+        <w:tc>
+          <w:tcPr>
+            <w:tcW w:type="dxa" w:w="2484"/>
+          </w:tcPr>
+          <w:p>
+            <w:r>
+              <w:rPr>
+                <w:sz w:val="20"/>
+              </w:rPr>
+              <w:t>Death</w:t>
+            </w:r>
+          </w:p>
+        </w:tc>
+        <w:tc>
+          <w:tcPr>
+            <w:tcW w:type="dxa" w:w="2484"/>
+          </w:tcPr>
+          <w:p>
+            <w:r>
+              <w:rPr>
+                <w:sz w:val="20"/>
+              </w:rPr>
+              <w:t>Smoker</w:t>
+            </w:r>
+          </w:p>
+        </w:tc>
+        <w:tc>
+          <w:tcPr>
+            <w:tcW w:type="dxa" w:w="2484"/>
+          </w:tcPr>
+          <w:p>
+            <w:r>
+              <w:rPr>
+                <w:sz w:val="20"/>
+              </w:rPr>
+              <w:t>0.848</w:t>
+            </w:r>
+          </w:p>
+        </w:tc>
+        <w:tc>
+          <w:tcPr>
+            <w:tcW w:type="dxa" w:w="2484"/>
+          </w:tcPr>
+          <w:p>
+            <w:r>
+              <w:rPr>
+                <w:sz w:val="20"/>
+              </w:rPr>
+              <w:t>0.530 to 1.355</w:t>
+            </w:r>
+          </w:p>
+        </w:tc>
+      </w:tr>
+    </w:tbl>
+    <w:p/>
+    <w:p>
+      <w:r>
+        <w:t>The split-record Cox analysis uses interval entry times and a single active record per worker at each event. Model-based information provides uncertainty under independent worker event processes; repeated rows are not treated as recurrent events. Both competing events remove a worker from subsequent risk sets. Missing smoking remains missing for estimation, although a latent smoking value is simulated to generate outcomes.</w:t>
+      </w:r>
+    </w:p>
+    <w:p>
+      <w:r>
+        <w:t>No Fine-Gray model, causal effect of exposure reduction or individual risk prediction is claimed. The bootstrap uses 200 replicates to keep the demonstration small; more replicates and cluster-aware analysis would be needed for a real workforce.</w:t>
+      </w:r>
+    </w:p>
+    <w:p>
+      <w:r>
+        <w:br w:type="page"/>
+      </w:r>
+    </w:p>
+    <w:p>
+      <w:pPr>
+        <w:pStyle w:val="Heading1"/>
+      </w:pPr>
+      <w:r>
         <w:t>Interpretation limitations and reproducibility</w:t>
       </w:r>
     </w:p>
@@ -2184,7 +3183,7 @@
     </w:p>
     <w:p>
       <w:r>
-        <w:t>The design omits competing mortality, healthy worker selection, diagnostic misclassification, time-varying exposures and informative loss to follow-up. The five-year lag is a declared modelling choice. Twelve workplaces are not sufficient to justify complex hierarchical inference without further investigation. The independent nature of the project is explicit; it uses no institutional patient data and is not endorsed by NIOH.</w:t>
+        <w:t>The baseline reference scenario omits competing mortality and time-varying exposure; the extension adds these explicitly. Both scenarios omit healthy worker selection, diagnostic misclassification and informative loss to follow-up. The five-year lag is a declared modelling choice. Twelve workplaces are not sufficient to justify complex hierarchical inference without further investigation. The independent nature of the project is explicit; it uses no institutional patient data and is not endorsed by NIOH.</w:t>
       </w:r>
     </w:p>
     <w:p>

</xml_diff>